<commit_message>
﻿Publish the GCSE, IGCSE 0455 and A-Level Economics year packs
Adds the Cambridge IGCSE Economics 0455 product page with its free sample, pushes the GCSE Business Year 10 page live, and applies the Economics page corrections. Buy buttons point at the teacher group with a findable PURCHASE_URL_HERE marker until the checkout links exist, so no button leads to a dead page. The premium section of the resource hub now lists all four year packs.

Co-Authored-By: Claude Fable 5 <noreply@anthropic.com>
</commit_message>
<xml_diff>
--- a/resources/a-level-economics-the-complete-year/A-Level-Economics-The-Complete-Year-FREE-SAMPLE-Week-1-EDITABLE.docx
+++ b/resources/a-level-economics-the-complete-year/A-Level-Economics-The-Complete-Year-FREE-SAMPLE-Week-1-EDITABLE.docx
@@ -1308,7 +1308,7 @@
               <w:rPr>
                 <w:sz w:val="18"/>
               </w:rPr>
-              <w:t>Model lines</w:t>
+              <w:t>B normative, E positive</w:t>
             </w:r>
           </w:p>
         </w:tc>
@@ -1352,7 +1352,7 @@
               <w:rPr>
                 <w:sz w:val="18"/>
               </w:rPr>
-              <w:t>Model line</w:t>
+              <w:t>Scarcity forces choice</w:t>
             </w:r>
           </w:p>
         </w:tc>
@@ -2181,7 +2181,7 @@
               <w:rPr>
                 <w:sz w:val="18"/>
               </w:rPr>
-              <w:t>Model line</w:t>
+              <w:t>More resources, or better technology</w:t>
             </w:r>
           </w:p>
         </w:tc>

</xml_diff>